<commit_message>
CS1105 Unit 8: definition and glossary, cite NASM for scope, floating-bus point, precision fixes
Co-Authored-By: Claude Opus 5.5 <noreply@anthropic.com>
</commit_message>
<xml_diff>
--- a/CS1105_Digital_Electronics_Architecture/Unit8_Compiler_Processes/Assignment/Unit8_Assignment_Activity.docx
+++ b/CS1105_Digital_Electronics_Architecture/Unit8_Compiler_Processes/Assignment/Unit8_Assignment_Activity.docx
@@ -168,6 +168,537 @@
     </w:p>
     <w:p>
       <w:pPr>
+        <w:pStyle w:val="Heading2"/>
+        <w:jc w:val="left"/>
+      </w:pPr>
+      <w:r>
+        <w:rPr>
+          <w:rFonts w:ascii="Times New Roman" w:hAnsi="Times New Roman"/>
+          <w:b/>
+          <w:color w:val="000000"/>
+          <w:sz w:val="24"/>
+        </w:rPr>
+        <w:t>What Symbol Resolution Means</w:t>
+      </w:r>
+    </w:p>
+    <w:p>
+      <w:pPr>
+        <w:spacing w:line="360" w:lineRule="auto" w:after="200"/>
+      </w:pPr>
+      <w:r>
+        <w:rPr>
+          <w:rFonts w:ascii="Times New Roman" w:hAnsi="Times New Roman"/>
+          <w:b/>
+          <w:i w:val="0"/>
+          <w:sz w:val="24"/>
+        </w:rPr>
+        <w:t>Symbol resolution is the process of matching every use of a name (a reference) to exactly one meaning (a definition), and then replacing the name with the value, address, or connection that the hardware actually uses.</w:t>
+      </w:r>
+      <w:r>
+        <w:rPr>
+          <w:rFonts w:ascii="Times New Roman" w:hAnsi="Times New Roman"/>
+          <w:b w:val="0"/>
+          <w:i w:val="0"/>
+          <w:sz w:val="24"/>
+        </w:rPr>
+        <w:t xml:space="preserve"> It always answers the same two questions: which definition does this name refer to, and what number or wire does that definition stand for? Table 1 gives the terms used in the rest of this lesson.</w:t>
+      </w:r>
+    </w:p>
+    <w:p>
+      <w:pPr>
+        <w:spacing w:line="360" w:lineRule="auto" w:after="0"/>
+      </w:pPr>
+      <w:r>
+        <w:rPr>
+          <w:rFonts w:ascii="Times New Roman" w:hAnsi="Times New Roman"/>
+          <w:b/>
+          <w:i w:val="0"/>
+          <w:sz w:val="24"/>
+        </w:rPr>
+        <w:t>Table 1</w:t>
+      </w:r>
+    </w:p>
+    <w:p>
+      <w:pPr>
+        <w:spacing w:line="360" w:lineRule="auto" w:after="0"/>
+      </w:pPr>
+      <w:r>
+        <w:rPr>
+          <w:rFonts w:ascii="Times New Roman" w:hAnsi="Times New Roman"/>
+          <w:b w:val="0"/>
+          <w:i/>
+          <w:sz w:val="24"/>
+        </w:rPr>
+        <w:t>Key Terms for Beginners</w:t>
+      </w:r>
+    </w:p>
+    <w:tbl>
+      <w:tblPr>
+        <w:tblStyle w:val="TableGrid"/>
+        <w:tblW w:type="auto" w:w="0"/>
+        <w:tblLook w:firstColumn="1" w:firstRow="1" w:lastColumn="0" w:lastRow="0" w:noHBand="0" w:noVBand="1" w:val="04A0"/>
+      </w:tblPr>
+      <w:tblGrid>
+        <w:gridCol w:w="3120"/>
+        <w:gridCol w:w="3120"/>
+        <w:gridCol w:w="3120"/>
+      </w:tblGrid>
+      <w:tr>
+        <w:tc>
+          <w:tcPr>
+            <w:tcW w:type="dxa" w:w="3120"/>
+          </w:tcPr>
+          <w:p>
+            <w:pPr>
+              <w:spacing w:line="240" w:lineRule="auto"/>
+            </w:pPr>
+            <w:r>
+              <w:rPr>
+                <w:rFonts w:ascii="Times New Roman" w:hAnsi="Times New Roman"/>
+                <w:b/>
+                <w:sz w:val="21"/>
+              </w:rPr>
+              <w:t>Term</w:t>
+            </w:r>
+          </w:p>
+        </w:tc>
+        <w:tc>
+          <w:tcPr>
+            <w:tcW w:type="dxa" w:w="3120"/>
+          </w:tcPr>
+          <w:p>
+            <w:pPr>
+              <w:spacing w:line="240" w:lineRule="auto"/>
+            </w:pPr>
+            <w:r>
+              <w:rPr>
+                <w:rFonts w:ascii="Times New Roman" w:hAnsi="Times New Roman"/>
+                <w:b/>
+                <w:sz w:val="21"/>
+              </w:rPr>
+              <w:t>Meaning</w:t>
+            </w:r>
+          </w:p>
+        </w:tc>
+        <w:tc>
+          <w:tcPr>
+            <w:tcW w:type="dxa" w:w="3120"/>
+          </w:tcPr>
+          <w:p>
+            <w:pPr>
+              <w:spacing w:line="240" w:lineRule="auto"/>
+            </w:pPr>
+            <w:r>
+              <w:rPr>
+                <w:rFonts w:ascii="Times New Roman" w:hAnsi="Times New Roman"/>
+                <w:b/>
+                <w:sz w:val="21"/>
+              </w:rPr>
+              <w:t>Example from this paper</w:t>
+            </w:r>
+          </w:p>
+        </w:tc>
+      </w:tr>
+      <w:tr>
+        <w:tc>
+          <w:tcPr>
+            <w:tcW w:type="dxa" w:w="3120"/>
+          </w:tcPr>
+          <w:p>
+            <w:pPr>
+              <w:spacing w:line="240" w:lineRule="auto"/>
+            </w:pPr>
+            <w:r>
+              <w:rPr>
+                <w:rFonts w:ascii="Times New Roman" w:hAnsi="Times New Roman"/>
+                <w:b w:val="0"/>
+                <w:sz w:val="21"/>
+              </w:rPr>
+              <w:t>Symbol</w:t>
+            </w:r>
+          </w:p>
+        </w:tc>
+        <w:tc>
+          <w:tcPr>
+            <w:tcW w:type="dxa" w:w="3120"/>
+          </w:tcPr>
+          <w:p>
+            <w:pPr>
+              <w:spacing w:line="240" w:lineRule="auto"/>
+            </w:pPr>
+            <w:r>
+              <w:rPr>
+                <w:rFonts w:ascii="Times New Roman" w:hAnsi="Times New Roman"/>
+                <w:b w:val="0"/>
+                <w:sz w:val="21"/>
+              </w:rPr>
+              <w:t>A name for a location, value, or signal</w:t>
+            </w:r>
+          </w:p>
+        </w:tc>
+        <w:tc>
+          <w:tcPr>
+            <w:tcW w:type="dxa" w:w="3120"/>
+          </w:tcPr>
+          <w:p>
+            <w:pPr>
+              <w:spacing w:line="240" w:lineRule="auto"/>
+            </w:pPr>
+            <w:r>
+              <w:rPr>
+                <w:rFonts w:ascii="Times New Roman" w:hAnsi="Times New Roman"/>
+                <w:b w:val="0"/>
+                <w:sz w:val="21"/>
+              </w:rPr>
+              <w:t>counter, print_msg, the wire label bus</w:t>
+            </w:r>
+          </w:p>
+        </w:tc>
+      </w:tr>
+      <w:tr>
+        <w:tc>
+          <w:tcPr>
+            <w:tcW w:type="dxa" w:w="3120"/>
+          </w:tcPr>
+          <w:p>
+            <w:pPr>
+              <w:spacing w:line="240" w:lineRule="auto"/>
+            </w:pPr>
+            <w:r>
+              <w:rPr>
+                <w:rFonts w:ascii="Times New Roman" w:hAnsi="Times New Roman"/>
+                <w:b w:val="0"/>
+                <w:sz w:val="21"/>
+              </w:rPr>
+              <w:t>Definition</w:t>
+            </w:r>
+          </w:p>
+        </w:tc>
+        <w:tc>
+          <w:tcPr>
+            <w:tcW w:type="dxa" w:w="3120"/>
+          </w:tcPr>
+          <w:p>
+            <w:pPr>
+              <w:spacing w:line="240" w:lineRule="auto"/>
+            </w:pPr>
+            <w:r>
+              <w:rPr>
+                <w:rFonts w:ascii="Times New Roman" w:hAnsi="Times New Roman"/>
+                <w:b w:val="0"/>
+                <w:sz w:val="21"/>
+              </w:rPr>
+              <w:t>The one place where a symbol is given its meaning</w:t>
+            </w:r>
+          </w:p>
+        </w:tc>
+        <w:tc>
+          <w:tcPr>
+            <w:tcW w:type="dxa" w:w="3120"/>
+          </w:tcPr>
+          <w:p>
+            <w:pPr>
+              <w:spacing w:line="240" w:lineRule="auto"/>
+            </w:pPr>
+            <w:r>
+              <w:rPr>
+                <w:rFonts w:ascii="Times New Roman" w:hAnsi="Times New Roman"/>
+                <w:b w:val="0"/>
+                <w:sz w:val="21"/>
+              </w:rPr>
+              <w:t>print_msg: in lib.asm</w:t>
+            </w:r>
+          </w:p>
+        </w:tc>
+      </w:tr>
+      <w:tr>
+        <w:tc>
+          <w:tcPr>
+            <w:tcW w:type="dxa" w:w="3120"/>
+          </w:tcPr>
+          <w:p>
+            <w:pPr>
+              <w:spacing w:line="240" w:lineRule="auto"/>
+            </w:pPr>
+            <w:r>
+              <w:rPr>
+                <w:rFonts w:ascii="Times New Roman" w:hAnsi="Times New Roman"/>
+                <w:b w:val="0"/>
+                <w:sz w:val="21"/>
+              </w:rPr>
+              <w:t>Reference</w:t>
+            </w:r>
+          </w:p>
+        </w:tc>
+        <w:tc>
+          <w:tcPr>
+            <w:tcW w:type="dxa" w:w="3120"/>
+          </w:tcPr>
+          <w:p>
+            <w:pPr>
+              <w:spacing w:line="240" w:lineRule="auto"/>
+            </w:pPr>
+            <w:r>
+              <w:rPr>
+                <w:rFonts w:ascii="Times New Roman" w:hAnsi="Times New Roman"/>
+                <w:b w:val="0"/>
+                <w:sz w:val="21"/>
+              </w:rPr>
+              <w:t>A place where a symbol is used</w:t>
+            </w:r>
+          </w:p>
+        </w:tc>
+        <w:tc>
+          <w:tcPr>
+            <w:tcW w:type="dxa" w:w="3120"/>
+          </w:tcPr>
+          <w:p>
+            <w:pPr>
+              <w:spacing w:line="240" w:lineRule="auto"/>
+            </w:pPr>
+            <w:r>
+              <w:rPr>
+                <w:rFonts w:ascii="Times New Roman" w:hAnsi="Times New Roman"/>
+                <w:b w:val="0"/>
+                <w:sz w:val="21"/>
+              </w:rPr>
+              <w:t>call print_msg in main.asm</w:t>
+            </w:r>
+          </w:p>
+        </w:tc>
+      </w:tr>
+      <w:tr>
+        <w:tc>
+          <w:tcPr>
+            <w:tcW w:type="dxa" w:w="3120"/>
+          </w:tcPr>
+          <w:p>
+            <w:pPr>
+              <w:spacing w:line="240" w:lineRule="auto"/>
+            </w:pPr>
+            <w:r>
+              <w:rPr>
+                <w:rFonts w:ascii="Times New Roman" w:hAnsi="Times New Roman"/>
+                <w:b w:val="0"/>
+                <w:sz w:val="21"/>
+              </w:rPr>
+              <w:t>Symbol table</w:t>
+            </w:r>
+          </w:p>
+        </w:tc>
+        <w:tc>
+          <w:tcPr>
+            <w:tcW w:type="dxa" w:w="3120"/>
+          </w:tcPr>
+          <w:p>
+            <w:pPr>
+              <w:spacing w:line="240" w:lineRule="auto"/>
+            </w:pPr>
+            <w:r>
+              <w:rPr>
+                <w:rFonts w:ascii="Times New Roman" w:hAnsi="Times New Roman"/>
+                <w:b w:val="0"/>
+                <w:sz w:val="21"/>
+              </w:rPr>
+              <w:t>The assembler's list of every symbol and its address</w:t>
+            </w:r>
+          </w:p>
+        </w:tc>
+        <w:tc>
+          <w:tcPr>
+            <w:tcW w:type="dxa" w:w="3120"/>
+          </w:tcPr>
+          <w:p>
+            <w:pPr>
+              <w:spacing w:line="240" w:lineRule="auto"/>
+            </w:pPr>
+            <w:r>
+              <w:rPr>
+                <w:rFonts w:ascii="Times New Roman" w:hAnsi="Times New Roman"/>
+                <w:b w:val="0"/>
+                <w:sz w:val="21"/>
+              </w:rPr>
+              <w:t>done = offset 0x0E</w:t>
+            </w:r>
+          </w:p>
+        </w:tc>
+      </w:tr>
+      <w:tr>
+        <w:tc>
+          <w:tcPr>
+            <w:tcW w:type="dxa" w:w="3120"/>
+          </w:tcPr>
+          <w:p>
+            <w:pPr>
+              <w:spacing w:line="240" w:lineRule="auto"/>
+            </w:pPr>
+            <w:r>
+              <w:rPr>
+                <w:rFonts w:ascii="Times New Roman" w:hAnsi="Times New Roman"/>
+                <w:b w:val="0"/>
+                <w:sz w:val="21"/>
+              </w:rPr>
+              <w:t>Linker</w:t>
+            </w:r>
+          </w:p>
+        </w:tc>
+        <w:tc>
+          <w:tcPr>
+            <w:tcW w:type="dxa" w:w="3120"/>
+          </w:tcPr>
+          <w:p>
+            <w:pPr>
+              <w:spacing w:line="240" w:lineRule="auto"/>
+            </w:pPr>
+            <w:r>
+              <w:rPr>
+                <w:rFonts w:ascii="Times New Roman" w:hAnsi="Times New Roman"/>
+                <w:b w:val="0"/>
+                <w:sz w:val="21"/>
+              </w:rPr>
+              <w:t>The program that joins object files and resolves names across them</w:t>
+            </w:r>
+          </w:p>
+        </w:tc>
+        <w:tc>
+          <w:tcPr>
+            <w:tcW w:type="dxa" w:w="3120"/>
+          </w:tcPr>
+          <w:p>
+            <w:pPr>
+              <w:spacing w:line="240" w:lineRule="auto"/>
+            </w:pPr>
+            <w:r>
+              <w:rPr>
+                <w:rFonts w:ascii="Times New Roman" w:hAnsi="Times New Roman"/>
+                <w:b w:val="0"/>
+                <w:sz w:val="21"/>
+              </w:rPr>
+              <w:t>ld</w:t>
+            </w:r>
+          </w:p>
+        </w:tc>
+      </w:tr>
+      <w:tr>
+        <w:tc>
+          <w:tcPr>
+            <w:tcW w:type="dxa" w:w="3120"/>
+          </w:tcPr>
+          <w:p>
+            <w:pPr>
+              <w:spacing w:line="240" w:lineRule="auto"/>
+            </w:pPr>
+            <w:r>
+              <w:rPr>
+                <w:rFonts w:ascii="Times New Roman" w:hAnsi="Times New Roman"/>
+                <w:b w:val="0"/>
+                <w:sz w:val="21"/>
+              </w:rPr>
+              <w:t>Relocation</w:t>
+            </w:r>
+          </w:p>
+        </w:tc>
+        <w:tc>
+          <w:tcPr>
+            <w:tcW w:type="dxa" w:w="3120"/>
+          </w:tcPr>
+          <w:p>
+            <w:pPr>
+              <w:spacing w:line="240" w:lineRule="auto"/>
+            </w:pPr>
+            <w:r>
+              <w:rPr>
+                <w:rFonts w:ascii="Times New Roman" w:hAnsi="Times New Roman"/>
+                <w:b w:val="0"/>
+                <w:sz w:val="21"/>
+              </w:rPr>
+              <w:t>Writing a symbol's final address into the machine code</w:t>
+            </w:r>
+          </w:p>
+        </w:tc>
+        <w:tc>
+          <w:tcPr>
+            <w:tcW w:type="dxa" w:w="3120"/>
+          </w:tcPr>
+          <w:p>
+            <w:pPr>
+              <w:spacing w:line="240" w:lineRule="auto"/>
+            </w:pPr>
+            <w:r>
+              <w:rPr>
+                <w:rFonts w:ascii="Times New Roman" w:hAnsi="Times New Roman"/>
+                <w:b w:val="0"/>
+                <w:sz w:val="21"/>
+              </w:rPr>
+              <w:t>call becomes E8 1B 00 00 00</w:t>
+            </w:r>
+          </w:p>
+        </w:tc>
+      </w:tr>
+      <w:tr>
+        <w:tc>
+          <w:tcPr>
+            <w:tcW w:type="dxa" w:w="3120"/>
+          </w:tcPr>
+          <w:p>
+            <w:pPr>
+              <w:spacing w:line="240" w:lineRule="auto"/>
+            </w:pPr>
+            <w:r>
+              <w:rPr>
+                <w:rFonts w:ascii="Times New Roman" w:hAnsi="Times New Roman"/>
+                <w:b w:val="0"/>
+                <w:sz w:val="21"/>
+              </w:rPr>
+              <w:t>Net</w:t>
+            </w:r>
+          </w:p>
+        </w:tc>
+        <w:tc>
+          <w:tcPr>
+            <w:tcW w:type="dxa" w:w="3120"/>
+          </w:tcPr>
+          <w:p>
+            <w:pPr>
+              <w:spacing w:line="240" w:lineRule="auto"/>
+            </w:pPr>
+            <w:r>
+              <w:rPr>
+                <w:rFonts w:ascii="Times New Roman" w:hAnsi="Times New Roman"/>
+                <w:b w:val="0"/>
+                <w:sz w:val="21"/>
+              </w:rPr>
+              <w:t>A set of connected points in a circuit that carries one value</w:t>
+            </w:r>
+          </w:p>
+        </w:tc>
+        <w:tc>
+          <w:tcPr>
+            <w:tcW w:type="dxa" w:w="3120"/>
+          </w:tcPr>
+          <w:p>
+            <w:pPr>
+              <w:spacing w:line="240" w:lineRule="auto"/>
+            </w:pPr>
+            <w:r>
+              <w:rPr>
+                <w:rFonts w:ascii="Times New Roman" w:hAnsi="Times New Roman"/>
+                <w:b w:val="0"/>
+                <w:sz w:val="21"/>
+              </w:rPr>
+              <w:t>all tunnels labelled bus</w:t>
+            </w:r>
+          </w:p>
+        </w:tc>
+      </w:tr>
+    </w:tbl>
+    <w:p>
+      <w:pPr>
+        <w:spacing w:after="0"/>
+      </w:pPr>
+    </w:p>
+    <w:p>
+      <w:pPr>
         <w:pStyle w:val="Heading1"/>
         <w:jc w:val="left"/>
       </w:pPr>
@@ -207,7 +738,7 @@
           <w:i w:val="0"/>
           <w:sz w:val="24"/>
         </w:rPr>
-        <w:t>In digital logic, the most basic symbols are the values on a wire: 0, 1, and in some circuits a floating "nothing is driving this" value. Larger circuits also use names. Logisim's tunnel component, for example, connects every point that carries the same label, so a signal can reach a distant part of the circuit without a long wire (Burch, n.d.-b). The simulator must therefore resolve two things on every clock tick: which points belong to the same named net, and what single value that net carries when several components drive it. If two outputs place different values on the same wire, the value cannot be resolved, and Logisim shows the wire in red with an error value (Burch, n.d.-a). Correct resolution is what makes a wire carry exactly one meaningful value.</w:t>
+        <w:t>In digital logic, the most basic symbols are the values on a wire: 0, 1, and in some circuits a floating "nothing is driving this" value. Larger circuits also use names. Logisim's tunnel component, for example, connects every point that carries the same label, so a signal can reach a distant part of the circuit without a long wire (Burch, n.d.-b). The simulator must therefore resolve two things whenever a value in the circuit changes: which points belong to the same named net, and what single value that net carries when several components drive it. If two outputs place different values on the same wire, the value cannot be resolved, and Logisim shows the wire in red with an error value (Burch, n.d.-a). Correct resolution is what makes a wire carry exactly one meaningful value.</w:t>
       </w:r>
     </w:p>
     <w:p>
@@ -380,7 +911,7 @@
           <w:i w:val="0"/>
           <w:sz w:val="24"/>
         </w:rPr>
-        <w:t>Table 1</w:t>
+        <w:t>Table 2</w:t>
       </w:r>
     </w:p>
     <w:p>
@@ -479,7 +1010,7 @@
                 <w:b w:val="0"/>
                 <w:sz w:val="21"/>
               </w:rPr>
-              <w:t>1. A symbol stands for an address or value, not for the data itself</w:t>
+              <w:t>1. A label names a location, not what is stored there</w:t>
             </w:r>
           </w:p>
         </w:tc>
@@ -497,7 +1028,7 @@
                 <w:b w:val="0"/>
                 <w:sz w:val="21"/>
               </w:rPr>
-              <w:t>In LDR r1, =num, the label num means the address where 5 is stored, not 5 (Kann, 2021, Section 4.4)</w:t>
+              <w:t>In LDR r1, =num, the label num means the address where 5 is stored, not 5 itself (Kann, 2021, Section 4.4)</w:t>
             </w:r>
           </w:p>
         </w:tc>
@@ -721,7 +1252,7 @@
                 <w:b w:val="0"/>
                 <w:sz w:val="21"/>
               </w:rPr>
-              <w:t>Local labels are resolved inside one file; global (exported) and extern (imported) symbols are resolved across files</w:t>
+              <w:t>Local labels are resolved inside one file; EXTERN declares a symbol defined in another module, and the defining module must export it with GLOBAL (NASM Development Team, n.d., Sections 8.5 and 8.7)</w:t>
             </w:r>
           </w:p>
         </w:tc>
@@ -889,7 +1420,7 @@
                 <w:b w:val="0"/>
                 <w:sz w:val="21"/>
               </w:rPr>
-              <w:t>An unresolved name is reported before the program ever runs</w:t>
+              <w:t>An unresolved or duplicated name is reported before the program ever runs, as Examples 3 and 4 show</w:t>
             </w:r>
           </w:p>
         </w:tc>
@@ -1144,7 +1675,7 @@
           <w:i w:val="0"/>
           <w:sz w:val="24"/>
         </w:rPr>
-        <w:t>Table 2</w:t>
+        <w:t>Table 3</w:t>
       </w:r>
     </w:p>
     <w:p>
@@ -2146,7 +2677,7 @@
           <w:i w:val="0"/>
           <w:sz w:val="24"/>
         </w:rPr>
-        <w:t>Table 3</w:t>
+        <w:t>Table 4</w:t>
       </w:r>
     </w:p>
     <w:p>
@@ -2694,7 +3225,7 @@
           <w:i w:val="0"/>
           <w:sz w:val="24"/>
         </w:rPr>
-        <w:t>Table 4</w:t>
+        <w:t>Table 5</w:t>
       </w:r>
     </w:p>
     <w:p>
@@ -3512,6 +4043,50 @@
           <w:i w:val="0"/>
           <w:sz w:val="24"/>
         </w:rPr>
+        <w:t xml:space="preserve">NASM Development Team. (n.d.). Chapter 8: Assembler directives. In </w:t>
+      </w:r>
+      <w:r>
+        <w:rPr>
+          <w:rFonts w:ascii="Times New Roman" w:hAnsi="Times New Roman"/>
+          <w:b w:val="0"/>
+          <w:i/>
+          <w:sz w:val="24"/>
+        </w:rPr>
+        <w:t>NASM: The Netwide Assembler</w:t>
+      </w:r>
+      <w:r>
+        <w:rPr>
+          <w:rFonts w:ascii="Times New Roman" w:hAnsi="Times New Roman"/>
+          <w:b w:val="0"/>
+          <w:i w:val="0"/>
+          <w:sz w:val="24"/>
+        </w:rPr>
+        <w:t xml:space="preserve">. </w:t>
+      </w:r>
+      <w:hyperlink r:id="rId21">
+        <w:r>
+          <w:rPr>
+            <w:rFonts w:ascii="Times New Roman" w:hAnsi="Times New Roman"/>
+            <w:color w:val="0563C1"/>
+            <w:u w:val="single"/>
+            <w:sz w:val="24"/>
+          </w:rPr>
+          <w:t>https://www.nasm.us/doc/nasmdoc8.html</w:t>
+        </w:r>
+      </w:hyperlink>
+    </w:p>
+    <w:p>
+      <w:pPr>
+        <w:spacing w:line="360" w:lineRule="auto" w:after="0"/>
+        <w:ind w:left="720" w:hanging="720"/>
+      </w:pPr>
+      <w:r>
+        <w:rPr>
+          <w:rFonts w:ascii="Times New Roman" w:hAnsi="Times New Roman"/>
+          <w:b w:val="0"/>
+          <w:i w:val="0"/>
+          <w:sz w:val="24"/>
+        </w:rPr>
         <w:t xml:space="preserve">WatElectronics. (2020, April 27). </w:t>
       </w:r>
       <w:r>
@@ -3532,7 +4107,7 @@
         </w:rPr>
         <w:t xml:space="preserve">. </w:t>
       </w:r>
-      <w:hyperlink r:id="rId21">
+      <w:hyperlink r:id="rId22">
         <w:r>
           <w:rPr>
             <w:rFonts w:ascii="Times New Roman" w:hAnsi="Times New Roman"/>

</xml_diff>